<commit_message>
education(2026-04-09): regenerate 2 materials with unified format
Body 18pt, footer "藪医者の学び / 日付 / トピック", new A4 1-page cheatsheet DOCX (12mm margins, right-top QR), removed 研修医向け display labels. Source: ai-agent-team scripts/education_build.py.

Co-Authored-By: Claude Opus 4.6 (1M context) <noreply@anthropic.com>
</commit_message>
<xml_diff>
--- a/output/education/2026-04-09_behavioral-economics-mental-health-residents/behavioral-economics-mental-health-residents_guide_facilitator.docx
+++ b/output/education/2026-04-09_behavioral-economics-mental-health-residents/behavioral-economics-mental-health-residents_guide_facilitator.docx
@@ -9,7 +9,7 @@
       <w:r>
         <w:rPr>
           <w:rFonts w:ascii="Yu Gothic" w:hAnsi="Yu Gothic"/>
-          <w:sz w:val="40"/>
+          <w:sz w:val="44"/>
         </w:rPr>
         <w:t>ファシリテーターガイド — 行動経済学で支えるメンタルヘルス診療</w:t>
       </w:r>
@@ -22,7 +22,7 @@
       <w:r>
         <w:rPr>
           <w:rFonts w:ascii="Yu Gothic" w:hAnsi="Yu Gothic"/>
-          <w:sz w:val="30"/>
+          <w:sz w:val="32"/>
         </w:rPr>
         <w:t>1. チートシート(印刷して手元に持つ)</w:t>
       </w:r>
@@ -34,7 +34,7 @@
       <w:r>
         <w:rPr>
           <w:rFonts w:ascii="Yu Gothic" w:hAnsi="Yu Gothic"/>
-          <w:sz w:val="26"/>
+          <w:sz w:val="28"/>
         </w:rPr>
         <w:t>必要物品</w:t>
       </w:r>
@@ -90,7 +90,7 @@
       <w:r>
         <w:rPr>
           <w:rFonts w:ascii="Yu Gothic" w:hAnsi="Yu Gothic"/>
-          <w:sz w:val="26"/>
+          <w:sz w:val="28"/>
         </w:rPr>
         <w:t>タイムライン</w:t>
       </w:r>
@@ -116,7 +116,7 @@
               <w:rPr>
                 <w:rFonts w:ascii="Yu Gothic" w:hAnsi="Yu Gothic"/>
                 <w:b/>
-                <w:sz w:val="18"/>
+                <w:sz w:val="20"/>
               </w:rPr>
               <w:t>時間</w:t>
             </w:r>
@@ -131,7 +131,7 @@
               <w:rPr>
                 <w:rFonts w:ascii="Yu Gothic" w:hAnsi="Yu Gothic"/>
                 <w:b/>
-                <w:sz w:val="18"/>
+                <w:sz w:val="20"/>
               </w:rPr>
               <w:t>セクション</w:t>
             </w:r>
@@ -146,7 +146,7 @@
               <w:rPr>
                 <w:rFonts w:ascii="Yu Gothic" w:hAnsi="Yu Gothic"/>
                 <w:b/>
-                <w:sz w:val="18"/>
+                <w:sz w:val="20"/>
               </w:rPr>
               <w:t>声かけセリフ例</w:t>
             </w:r>
@@ -162,7 +162,7 @@
             <w:r>
               <w:rPr>
                 <w:rFonts w:ascii="Yu Gothic" w:hAnsi="Yu Gothic"/>
-                <w:sz w:val="18"/>
+                <w:sz w:val="20"/>
               </w:rPr>
               <w:t>0:00-2:00</w:t>
             </w:r>
@@ -176,7 +176,7 @@
             <w:r>
               <w:rPr>
                 <w:rFonts w:ascii="Yu Gothic" w:hAnsi="Yu Gothic"/>
-                <w:sz w:val="18"/>
+                <w:sz w:val="20"/>
               </w:rPr>
               <w:t>導入 + 持ち帰り3つの予告</w:t>
             </w:r>
@@ -190,7 +190,7 @@
             <w:r>
               <w:rPr>
                 <w:rFonts w:ascii="Yu Gothic" w:hAnsi="Yu Gothic"/>
-                <w:sz w:val="18"/>
+                <w:sz w:val="20"/>
               </w:rPr>
               <w:t>「今日のゴールは "説教ではなく設計" という言い換えを身につけることです。後半は外来全体の話になりますが、一緒に歩いていきましょう」</w:t>
             </w:r>
@@ -206,7 +206,7 @@
             <w:r>
               <w:rPr>
                 <w:rFonts w:ascii="Yu Gothic" w:hAnsi="Yu Gothic"/>
-                <w:sz w:val="18"/>
+                <w:sz w:val="20"/>
               </w:rPr>
               <w:t>2:00-5:00</w:t>
             </w:r>
@@ -220,7 +220,7 @@
             <w:r>
               <w:rPr>
                 <w:rFonts w:ascii="Yu Gothic" w:hAnsi="Yu Gothic"/>
-                <w:sz w:val="18"/>
+                <w:sz w:val="20"/>
               </w:rPr>
               <w:t>38歳うつ病女性の症例 + 「この人は怠けているのか?」隣と30秒</w:t>
             </w:r>
@@ -234,7 +234,7 @@
             <w:r>
               <w:rPr>
                 <w:rFonts w:ascii="Yu Gothic" w:hAnsi="Yu Gothic"/>
-                <w:sz w:val="18"/>
+                <w:sz w:val="20"/>
               </w:rPr>
               <w:t>「答えは出さなくていいです。"自分なら次に何を聞くか" を1つだけ決めてみてください」</w:t>
             </w:r>
@@ -250,7 +250,7 @@
             <w:r>
               <w:rPr>
                 <w:rFonts w:ascii="Yu Gothic" w:hAnsi="Yu Gothic"/>
-                <w:sz w:val="18"/>
+                <w:sz w:val="20"/>
               </w:rPr>
               <w:t>5:00-9:00</w:t>
             </w:r>
@@ -264,7 +264,7 @@
             <w:r>
               <w:rPr>
                 <w:rFonts w:ascii="Yu Gothic" w:hAnsi="Yu Gothic"/>
-                <w:sz w:val="18"/>
+                <w:sz w:val="20"/>
               </w:rPr>
               <w:t>報酬処理の連続体 + 3つの病名の共通回路</w:t>
             </w:r>
@@ -278,7 +278,7 @@
             <w:r>
               <w:rPr>
                 <w:rFonts w:ascii="Yu Gothic" w:hAnsi="Yu Gothic"/>
-                <w:sz w:val="18"/>
+                <w:sz w:val="20"/>
               </w:rPr>
               <w:t>「うつ病・依存症・不安症は別物のようで、実は同じ回路の異なる現れ方です。これは患者本人にも伝えていい話です」</w:t>
             </w:r>
@@ -294,7 +294,7 @@
             <w:r>
               <w:rPr>
                 <w:rFonts w:ascii="Yu Gothic" w:hAnsi="Yu Gothic"/>
-                <w:sz w:val="18"/>
+                <w:sz w:val="20"/>
               </w:rPr>
               <w:t>9:00-13:00</w:t>
             </w:r>
@@ -308,7 +308,7 @@
             <w:r>
               <w:rPr>
                 <w:rFonts w:ascii="Yu Gothic" w:hAnsi="Yu Gothic"/>
-                <w:sz w:val="18"/>
+                <w:sz w:val="20"/>
               </w:rPr>
               <w:t>3つの介入 + デシジョンツリー</w:t>
             </w:r>
@@ -322,7 +322,7 @@
             <w:r>
               <w:rPr>
                 <w:rFonts w:ascii="Yu Gothic" w:hAnsi="Yu Gothic"/>
-                <w:sz w:val="18"/>
+                <w:sz w:val="20"/>
               </w:rPr>
               <w:t>「最初は1つだけ覚えてくれればOK。3つあるんだ、ということを知っておくだけでも来週から見え方が変わります」</w:t>
             </w:r>
@@ -338,7 +338,7 @@
             <w:r>
               <w:rPr>
                 <w:rFonts w:ascii="Yu Gothic" w:hAnsi="Yu Gothic"/>
-                <w:sz w:val="18"/>
+                <w:sz w:val="20"/>
               </w:rPr>
               <w:t>13:00-16:00</w:t>
             </w:r>
@@ -352,7 +352,7 @@
             <w:r>
               <w:rPr>
                 <w:rFonts w:ascii="Yu Gothic" w:hAnsi="Yu Gothic"/>
-                <w:sz w:val="18"/>
+                <w:sz w:val="20"/>
               </w:rPr>
               <w:t>説教モード→設計モードの言い換え + 30秒ふりかえり</w:t>
             </w:r>
@@ -366,7 +366,7 @@
             <w:r>
               <w:rPr>
                 <w:rFonts w:ascii="Yu Gothic" w:hAnsi="Yu Gothic"/>
-                <w:sz w:val="18"/>
+                <w:sz w:val="20"/>
               </w:rPr>
               <w:t>「明日の外来1人目で1つだけ試してみてください。失敗してもOKです」</w:t>
             </w:r>
@@ -382,7 +382,7 @@
             <w:r>
               <w:rPr>
                 <w:rFonts w:ascii="Yu Gothic" w:hAnsi="Yu Gothic"/>
-                <w:sz w:val="18"/>
+                <w:sz w:val="20"/>
               </w:rPr>
               <w:t>16:00-19:00</w:t>
             </w:r>
@@ -396,7 +396,7 @@
             <w:r>
               <w:rPr>
                 <w:rFonts w:ascii="Yu Gothic" w:hAnsi="Yu Gothic"/>
-                <w:sz w:val="18"/>
+                <w:sz w:val="20"/>
               </w:rPr>
               <w:t>外来導線 → Penn Nudge Unit → マクロ予測</w:t>
             </w:r>
@@ -410,7 +410,7 @@
             <w:r>
               <w:rPr>
                 <w:rFonts w:ascii="Yu Gothic" w:hAnsi="Yu Gothic"/>
-                <w:sz w:val="18"/>
+                <w:sz w:val="20"/>
               </w:rPr>
               <w:t>「ここからは、すぐにはできないけど "知っておくと外来の見え方が変わる" 話をします」</w:t>
             </w:r>
@@ -426,7 +426,7 @@
             <w:r>
               <w:rPr>
                 <w:rFonts w:ascii="Yu Gothic" w:hAnsi="Yu Gothic"/>
-                <w:sz w:val="18"/>
+                <w:sz w:val="20"/>
               </w:rPr>
               <w:t>19:00-20:00</w:t>
             </w:r>
@@ -440,7 +440,7 @@
             <w:r>
               <w:rPr>
                 <w:rFonts w:ascii="Yu Gothic" w:hAnsi="Yu Gothic"/>
-                <w:sz w:val="18"/>
+                <w:sz w:val="20"/>
               </w:rPr>
               <w:t>まとめ + 任意の宿題</w:t>
             </w:r>
@@ -454,7 +454,7 @@
             <w:r>
               <w:rPr>
                 <w:rFonts w:ascii="Yu Gothic" w:hAnsi="Yu Gothic"/>
-                <w:sz w:val="18"/>
+                <w:sz w:val="20"/>
               </w:rPr>
               <w:t>「次回、試してみた話を1人1分で共有します」</w:t>
             </w:r>
@@ -470,7 +470,7 @@
       <w:r>
         <w:rPr>
           <w:rFonts w:ascii="Yu Gothic" w:hAnsi="Yu Gothic"/>
-          <w:sz w:val="26"/>
+          <w:sz w:val="28"/>
         </w:rPr>
         <w:t>困ったときの対処法</w:t>
       </w:r>
@@ -527,7 +527,7 @@
       <w:r>
         <w:rPr>
           <w:rFonts w:ascii="Yu Gothic" w:hAnsi="Yu Gothic"/>
-          <w:sz w:val="30"/>
+          <w:sz w:val="32"/>
         </w:rPr>
         <w:t>2. インストラクショナルデザイン</w:t>
       </w:r>
@@ -539,7 +539,7 @@
       <w:r>
         <w:rPr>
           <w:rFonts w:ascii="Yu Gothic" w:hAnsi="Yu Gothic"/>
-          <w:sz w:val="26"/>
+          <w:sz w:val="28"/>
         </w:rPr>
         <w:t>IDモデル: ガニェの9教授事象</w:t>
       </w:r>
@@ -565,7 +565,7 @@
               <w:rPr>
                 <w:rFonts w:ascii="Yu Gothic" w:hAnsi="Yu Gothic"/>
                 <w:b/>
-                <w:sz w:val="18"/>
+                <w:sz w:val="20"/>
               </w:rPr>
               <w:t>#</w:t>
             </w:r>
@@ -580,7 +580,7 @@
               <w:rPr>
                 <w:rFonts w:ascii="Yu Gothic" w:hAnsi="Yu Gothic"/>
                 <w:b/>
-                <w:sz w:val="18"/>
+                <w:sz w:val="20"/>
               </w:rPr>
               <w:t>教授事象</w:t>
             </w:r>
@@ -595,7 +595,7 @@
               <w:rPr>
                 <w:rFonts w:ascii="Yu Gothic" w:hAnsi="Yu Gothic"/>
                 <w:b/>
-                <w:sz w:val="18"/>
+                <w:sz w:val="20"/>
               </w:rPr>
               <w:t>本教材での実装</w:t>
             </w:r>
@@ -611,7 +611,7 @@
             <w:r>
               <w:rPr>
                 <w:rFonts w:ascii="Yu Gothic" w:hAnsi="Yu Gothic"/>
-                <w:sz w:val="18"/>
+                <w:sz w:val="20"/>
               </w:rPr>
               <w:t>1</w:t>
             </w:r>
@@ -625,7 +625,7 @@
             <w:r>
               <w:rPr>
                 <w:rFonts w:ascii="Yu Gothic" w:hAnsi="Yu Gothic"/>
-                <w:sz w:val="18"/>
+                <w:sz w:val="20"/>
               </w:rPr>
               <w:t>注意の獲得</w:t>
             </w:r>
@@ -639,7 +639,7 @@
             <w:r>
               <w:rPr>
                 <w:rFonts w:ascii="Yu Gothic" w:hAnsi="Yu Gothic"/>
-                <w:sz w:val="18"/>
+                <w:sz w:val="20"/>
               </w:rPr>
               <w:t>38歳うつ病女性症例「この人は怠けているのか?」</w:t>
             </w:r>
@@ -655,7 +655,7 @@
             <w:r>
               <w:rPr>
                 <w:rFonts w:ascii="Yu Gothic" w:hAnsi="Yu Gothic"/>
-                <w:sz w:val="18"/>
+                <w:sz w:val="20"/>
               </w:rPr>
               <w:t>2</w:t>
             </w:r>
@@ -669,7 +669,7 @@
             <w:r>
               <w:rPr>
                 <w:rFonts w:ascii="Yu Gothic" w:hAnsi="Yu Gothic"/>
-                <w:sz w:val="18"/>
+                <w:sz w:val="20"/>
               </w:rPr>
               <w:t>学習目標の予告</w:t>
             </w:r>
@@ -683,7 +683,7 @@
             <w:r>
               <w:rPr>
                 <w:rFonts w:ascii="Yu Gothic" w:hAnsi="Yu Gothic"/>
-                <w:sz w:val="18"/>
+                <w:sz w:val="20"/>
               </w:rPr>
               <w:t>冒頭「持ち帰ってもらう3つ」</w:t>
             </w:r>
@@ -699,7 +699,7 @@
             <w:r>
               <w:rPr>
                 <w:rFonts w:ascii="Yu Gothic" w:hAnsi="Yu Gothic"/>
-                <w:sz w:val="18"/>
+                <w:sz w:val="20"/>
               </w:rPr>
               <w:t>3</w:t>
             </w:r>
@@ -713,7 +713,7 @@
             <w:r>
               <w:rPr>
                 <w:rFonts w:ascii="Yu Gothic" w:hAnsi="Yu Gothic"/>
-                <w:sz w:val="18"/>
+                <w:sz w:val="20"/>
               </w:rPr>
               <w:t>前提知識の想起</w:t>
             </w:r>
@@ -727,7 +727,7 @@
             <w:r>
               <w:rPr>
                 <w:rFonts w:ascii="Yu Gothic" w:hAnsi="Yu Gothic"/>
-                <w:sz w:val="18"/>
+                <w:sz w:val="20"/>
               </w:rPr>
               <w:t>うつ病・服薬アドヒアランス・既習の生活習慣指導</w:t>
             </w:r>
@@ -743,7 +743,7 @@
             <w:r>
               <w:rPr>
                 <w:rFonts w:ascii="Yu Gothic" w:hAnsi="Yu Gothic"/>
-                <w:sz w:val="18"/>
+                <w:sz w:val="20"/>
               </w:rPr>
               <w:t>4</w:t>
             </w:r>
@@ -757,7 +757,7 @@
             <w:r>
               <w:rPr>
                 <w:rFonts w:ascii="Yu Gothic" w:hAnsi="Yu Gothic"/>
-                <w:sz w:val="18"/>
+                <w:sz w:val="20"/>
               </w:rPr>
               <w:t>新情報の提示</w:t>
             </w:r>
@@ -771,7 +771,7 @@
             <w:r>
               <w:rPr>
                 <w:rFonts w:ascii="Yu Gothic" w:hAnsi="Yu Gothic"/>
-                <w:sz w:val="18"/>
+                <w:sz w:val="20"/>
               </w:rPr>
               <w:t>報酬処理の連続体 → 3つの介入 → デシジョンツリー</w:t>
             </w:r>
@@ -787,7 +787,7 @@
             <w:r>
               <w:rPr>
                 <w:rFonts w:ascii="Yu Gothic" w:hAnsi="Yu Gothic"/>
-                <w:sz w:val="18"/>
+                <w:sz w:val="20"/>
               </w:rPr>
               <w:t>5</w:t>
             </w:r>
@@ -801,7 +801,7 @@
             <w:r>
               <w:rPr>
                 <w:rFonts w:ascii="Yu Gothic" w:hAnsi="Yu Gothic"/>
-                <w:sz w:val="18"/>
+                <w:sz w:val="20"/>
               </w:rPr>
               <w:t>学習のガイダンス</w:t>
             </w:r>
@@ -815,7 +815,7 @@
             <w:r>
               <w:rPr>
                 <w:rFonts w:ascii="Yu Gothic" w:hAnsi="Yu Gothic"/>
-                <w:sz w:val="18"/>
+                <w:sz w:val="20"/>
               </w:rPr>
               <w:t>症例への当てはめ表(各介入をこの症例に適用)</w:t>
             </w:r>
@@ -831,7 +831,7 @@
             <w:r>
               <w:rPr>
                 <w:rFonts w:ascii="Yu Gothic" w:hAnsi="Yu Gothic"/>
-                <w:sz w:val="18"/>
+                <w:sz w:val="20"/>
               </w:rPr>
               <w:t>6</w:t>
             </w:r>
@@ -845,7 +845,7 @@
             <w:r>
               <w:rPr>
                 <w:rFonts w:ascii="Yu Gothic" w:hAnsi="Yu Gothic"/>
-                <w:sz w:val="18"/>
+                <w:sz w:val="20"/>
               </w:rPr>
               <w:t>学習者の応答誘発</w:t>
             </w:r>
@@ -859,7 +859,7 @@
             <w:r>
               <w:rPr>
                 <w:rFonts w:ascii="Yu Gothic" w:hAnsi="Yu Gothic"/>
-                <w:sz w:val="18"/>
+                <w:sz w:val="20"/>
               </w:rPr>
               <w:t>隣と30秒、説教→設計の言い換え練習</w:t>
             </w:r>
@@ -875,7 +875,7 @@
             <w:r>
               <w:rPr>
                 <w:rFonts w:ascii="Yu Gothic" w:hAnsi="Yu Gothic"/>
-                <w:sz w:val="18"/>
+                <w:sz w:val="20"/>
               </w:rPr>
               <w:t>7</w:t>
             </w:r>
@@ -889,7 +889,7 @@
             <w:r>
               <w:rPr>
                 <w:rFonts w:ascii="Yu Gothic" w:hAnsi="Yu Gothic"/>
-                <w:sz w:val="18"/>
+                <w:sz w:val="20"/>
               </w:rPr>
               <w:t>フィードバック</w:t>
             </w:r>
@@ -903,7 +903,7 @@
             <w:r>
               <w:rPr>
                 <w:rFonts w:ascii="Yu Gothic" w:hAnsi="Yu Gothic"/>
-                <w:sz w:val="18"/>
+                <w:sz w:val="20"/>
               </w:rPr>
               <w:t>ファシリテーターからの声かけ(セリフ集参照)</w:t>
             </w:r>
@@ -919,7 +919,7 @@
             <w:r>
               <w:rPr>
                 <w:rFonts w:ascii="Yu Gothic" w:hAnsi="Yu Gothic"/>
-                <w:sz w:val="18"/>
+                <w:sz w:val="20"/>
               </w:rPr>
               <w:t>8</w:t>
             </w:r>
@@ -933,7 +933,7 @@
             <w:r>
               <w:rPr>
                 <w:rFonts w:ascii="Yu Gothic" w:hAnsi="Yu Gothic"/>
-                <w:sz w:val="18"/>
+                <w:sz w:val="20"/>
               </w:rPr>
               <w:t>達成度の評価</w:t>
             </w:r>
@@ -947,7 +947,7 @@
             <w:r>
               <w:rPr>
                 <w:rFonts w:ascii="Yu Gothic" w:hAnsi="Yu Gothic"/>
-                <w:sz w:val="18"/>
+                <w:sz w:val="20"/>
               </w:rPr>
               <w:t>任意の宿題「次回1人1分シェア」</w:t>
             </w:r>
@@ -963,7 +963,7 @@
             <w:r>
               <w:rPr>
                 <w:rFonts w:ascii="Yu Gothic" w:hAnsi="Yu Gothic"/>
-                <w:sz w:val="18"/>
+                <w:sz w:val="20"/>
               </w:rPr>
               <w:t>9</w:t>
             </w:r>
@@ -977,7 +977,7 @@
             <w:r>
               <w:rPr>
                 <w:rFonts w:ascii="Yu Gothic" w:hAnsi="Yu Gothic"/>
-                <w:sz w:val="18"/>
+                <w:sz w:val="20"/>
               </w:rPr>
               <w:t>保持と転移</w:t>
             </w:r>
@@ -991,7 +991,7 @@
             <w:r>
               <w:rPr>
                 <w:rFonts w:ascii="Yu Gothic" w:hAnsi="Yu Gothic"/>
-                <w:sz w:val="18"/>
+                <w:sz w:val="20"/>
               </w:rPr>
               <w:t>チートシート配布 + 半径を広げる視点提示</w:t>
             </w:r>
@@ -1007,7 +1007,7 @@
       <w:r>
         <w:rPr>
           <w:rFonts w:ascii="Yu Gothic" w:hAnsi="Yu Gothic"/>
-          <w:sz w:val="26"/>
+          <w:sz w:val="28"/>
         </w:rPr>
         <w:t>学習目標(ブルーム分類法)</w:t>
       </w:r>
@@ -1082,7 +1082,7 @@
       <w:r>
         <w:rPr>
           <w:rFonts w:ascii="Yu Gothic" w:hAnsi="Yu Gothic"/>
-          <w:sz w:val="30"/>
+          <w:sz w:val="32"/>
         </w:rPr>
         <w:t>3. ファシリテーター自身への注意</w:t>
       </w:r>
@@ -1147,7 +1147,7 @@
       <w:r>
         <w:rPr>
           <w:rFonts w:ascii="Yu Gothic" w:hAnsi="Yu Gothic"/>
-          <w:sz w:val="30"/>
+          <w:sz w:val="32"/>
         </w:rPr>
         <w:t>4. 参考文献(改ページ後、配布用)</w:t>
       </w:r>
@@ -1159,7 +1159,7 @@
       <w:r>
         <w:rPr>
           <w:rFonts w:ascii="Yu Gothic" w:hAnsi="Yu Gothic"/>
-          <w:sz w:val="26"/>
+          <w:sz w:val="28"/>
         </w:rPr>
         <w:t>主出典</w:t>
       </w:r>
@@ -1190,7 +1190,7 @@
       <w:r>
         <w:rPr>
           <w:rFonts w:ascii="Yu Gothic" w:hAnsi="Yu Gothic"/>
-          <w:sz w:val="26"/>
+          <w:sz w:val="28"/>
         </w:rPr>
         <w:t>副出典</w:t>
       </w:r>
@@ -1240,7 +1240,7 @@
       <w:r>
         <w:rPr>
           <w:rFonts w:ascii="Yu Gothic" w:hAnsi="Yu Gothic"/>
-          <w:sz w:val="26"/>
+          <w:sz w:val="28"/>
         </w:rPr>
         <w:t>背景文献</w:t>
       </w:r>
@@ -1285,7 +1285,7 @@
       <w:r>
         <w:rPr>
           <w:rFonts w:ascii="Yu Gothic" w:hAnsi="Yu Gothic"/>
-          <w:sz w:val="26"/>
+          <w:sz w:val="28"/>
         </w:rPr>
         <w:t>関連メモ</w:t>
       </w:r>
@@ -1343,7 +1343,7 @@
       <w:r>
         <w:drawing>
           <wp:inline xmlns:a="http://schemas.openxmlformats.org/drawingml/2006/main" xmlns:pic="http://schemas.openxmlformats.org/drawingml/2006/picture">
-            <wp:extent cx="1800000" cy="1800000"/>
+            <wp:extent cx="1440000" cy="1440000"/>
             <wp:docPr id="1" name="Picture 1"/>
             <wp:cNvGraphicFramePr>
               <a:graphicFrameLocks noChangeAspect="1"/>
@@ -1364,7 +1364,7 @@
                   <pic:spPr>
                     <a:xfrm>
                       <a:off x="0" y="0"/>
-                      <a:ext cx="1800000" cy="1800000"/>
+                      <a:ext cx="1440000" cy="1440000"/>
                     </a:xfrm>
                     <a:prstGeom prst="rect"/>
                   </pic:spPr>

</xml_diff>

<commit_message>
education(2026-04-09): book references QR-coded (Amazon URLs)
Added Amazon search URLs for book references and regenerated facilitator-guide
DOCXs with multi-reference QR grid (5-6 QRs per material).

Co-Authored-By: Claude Opus 4.6 (1M context) <noreply@anthropic.com>
</commit_message>
<xml_diff>
--- a/output/education/2026-04-09_behavioral-economics-mental-health-residents/behavioral-economics-mental-health-residents_guide_facilitator.docx
+++ b/output/education/2026-04-09_behavioral-economics-mental-health-residents/behavioral-economics-mental-health-residents_guide_facilitator.docx
@@ -1257,6 +1257,14 @@
       </w:r>
     </w:p>
     <w:p>
+      <w:r>
+        <w:rPr>
+          <w:rFonts w:ascii="Yu Gothic" w:hAnsi="Yu Gothic"/>
+        </w:rPr>
+        <w:t>&lt;https://www.amazon.co.jp/s?k=ファスト%26スロー+カーネマン+早川書房&gt;</w:t>
+      </w:r>
+    </w:p>
+    <w:p>
       <w:pPr>
         <w:pStyle w:val="ListBullet"/>
       </w:pPr>
@@ -1268,6 +1276,14 @@
       </w:r>
     </w:p>
     <w:p>
+      <w:r>
+        <w:rPr>
+          <w:rFonts w:ascii="Yu Gothic" w:hAnsi="Yu Gothic"/>
+        </w:rPr>
+        <w:t>&lt;https://www.amazon.co.jp/s?k=NUDGE+実践+行動経済学+セイラー+日経BP&gt;</w:t>
+      </w:r>
+    </w:p>
+    <w:p>
       <w:pPr>
         <w:pStyle w:val="ListBullet"/>
       </w:pPr>
@@ -1276,6 +1292,14 @@
           <w:rFonts w:ascii="Yu Gothic" w:hAnsi="Yu Gothic"/>
         </w:rPr>
         <w:t>NIMH RDoC Initiative: Positive Valence Systems (報酬処理関連の研究領域分類)</w:t>
+      </w:r>
+    </w:p>
+    <w:p>
+      <w:r>
+        <w:rPr>
+          <w:rFonts w:ascii="Yu Gothic" w:hAnsi="Yu Gothic"/>
+        </w:rPr>
+        <w:t>&lt;https://www.nimh.nih.gov/research/research-funded-by-nimh/rdoc/constructs/positive-valence-systems&gt;</w:t>
       </w:r>
     </w:p>
     <w:p>
@@ -1333,60 +1357,446 @@
         <w:rPr>
           <w:rFonts w:ascii="Yu Gothic" w:hAnsi="Yu Gothic"/>
         </w:rPr>
-        <w:t>出典 QR コード</w:t>
+        <w:t>参考文献 QR コード一覧</w:t>
       </w:r>
     </w:p>
     <w:p>
-      <w:pPr>
-        <w:jc w:val="center"/>
-      </w:pPr>
-      <w:r>
-        <w:drawing>
-          <wp:inline xmlns:a="http://schemas.openxmlformats.org/drawingml/2006/main" xmlns:pic="http://schemas.openxmlformats.org/drawingml/2006/picture">
-            <wp:extent cx="1440000" cy="1440000"/>
-            <wp:docPr id="1" name="Picture 1"/>
-            <wp:cNvGraphicFramePr>
-              <a:graphicFrameLocks noChangeAspect="1"/>
-            </wp:cNvGraphicFramePr>
-            <a:graphic>
-              <a:graphicData uri="http://schemas.openxmlformats.org/drawingml/2006/picture">
-                <pic:pic>
-                  <pic:nvPicPr>
-                    <pic:cNvPr id="0" name="image.png"/>
-                    <pic:cNvPicPr/>
-                  </pic:nvPicPr>
-                  <pic:blipFill>
-                    <a:blip r:embed="rId9"/>
-                    <a:stretch>
-                      <a:fillRect/>
-                    </a:stretch>
-                  </pic:blipFill>
-                  <pic:spPr>
-                    <a:xfrm>
-                      <a:off x="0" y="0"/>
-                      <a:ext cx="1440000" cy="1440000"/>
-                    </a:xfrm>
-                    <a:prstGeom prst="rect"/>
-                  </pic:spPr>
-                </pic:pic>
-              </a:graphicData>
-            </a:graphic>
-          </wp:inline>
-        </w:drawing>
-      </w:r>
-    </w:p>
-    <w:p>
-      <w:pPr>
-        <w:jc w:val="center"/>
-      </w:pPr>
       <w:r>
         <w:rPr>
           <w:rFonts w:ascii="Yu Gothic" w:hAnsi="Yu Gothic"/>
-          <w:sz w:val="16"/>
+          <w:sz w:val="18"/>
         </w:rPr>
-        <w:t>https://pmc.ncbi.nlm.nih.gov/articles/PMC11904746/</w:t>
+        <w:t>書籍は Amazon、論文・サイトは一次資料の URL を QR 化しています。</w:t>
       </w:r>
     </w:p>
+    <w:tbl>
+      <w:tblPr>
+        <w:tblW w:type="auto" w:w="0"/>
+        <w:jc w:val="center"/>
+        <w:tblLook w:firstColumn="1" w:firstRow="1" w:lastColumn="0" w:lastRow="0" w:noHBand="0" w:noVBand="1" w:val="04A0"/>
+      </w:tblPr>
+      <w:tblGrid>
+        <w:gridCol w:w="2160"/>
+        <w:gridCol w:w="2160"/>
+        <w:gridCol w:w="2160"/>
+        <w:gridCol w:w="2160"/>
+      </w:tblGrid>
+      <w:tr>
+        <w:tc>
+          <w:tcPr>
+            <w:tcW w:type="dxa" w:w="2160"/>
+          </w:tcPr>
+          <w:p>
+            <w:pPr>
+              <w:jc w:val="center"/>
+            </w:pPr>
+            <w:r>
+              <w:drawing>
+                <wp:inline xmlns:a="http://schemas.openxmlformats.org/drawingml/2006/main" xmlns:pic="http://schemas.openxmlformats.org/drawingml/2006/picture">
+                  <wp:extent cx="900000" cy="900000"/>
+                  <wp:docPr id="1" name="Picture 1"/>
+                  <wp:cNvGraphicFramePr>
+                    <a:graphicFrameLocks noChangeAspect="1"/>
+                  </wp:cNvGraphicFramePr>
+                  <a:graphic>
+                    <a:graphicData uri="http://schemas.openxmlformats.org/drawingml/2006/picture">
+                      <pic:pic>
+                        <pic:nvPicPr>
+                          <pic:cNvPr id="0" name="image.png"/>
+                          <pic:cNvPicPr/>
+                        </pic:nvPicPr>
+                        <pic:blipFill>
+                          <a:blip r:embed="rId9"/>
+                          <a:stretch>
+                            <a:fillRect/>
+                          </a:stretch>
+                        </pic:blipFill>
+                        <pic:spPr>
+                          <a:xfrm>
+                            <a:off x="0" y="0"/>
+                            <a:ext cx="900000" cy="900000"/>
+                          </a:xfrm>
+                          <a:prstGeom prst="rect"/>
+                        </pic:spPr>
+                      </pic:pic>
+                    </a:graphicData>
+                  </a:graphic>
+                </wp:inline>
+              </w:drawing>
+            </w:r>
+          </w:p>
+        </w:tc>
+        <w:tc>
+          <w:tcPr>
+            <w:tcW w:type="dxa" w:w="2160"/>
+          </w:tcPr>
+          <w:p>
+            <w:r>
+              <w:rPr>
+                <w:rFonts w:ascii="Calibri" w:hAnsi="Calibri"/>
+                <w:b/>
+                <w:sz w:val="16"/>
+              </w:rPr>
+              <w:t>Applications of Behavioral Economics…</w:t>
+            </w:r>
+          </w:p>
+          <w:p>
+            <w:r>
+              <w:rPr>
+                <w:color w:val="444499"/>
+                <w:sz w:val="12"/>
+              </w:rPr>
+              <w:t>https://pmc.ncbi.nlm.nih.gov/articles/PMC11904746/</w:t>
+            </w:r>
+          </w:p>
+        </w:tc>
+        <w:tc>
+          <w:tcPr>
+            <w:tcW w:type="dxa" w:w="2160"/>
+          </w:tcPr>
+          <w:p>
+            <w:pPr>
+              <w:jc w:val="center"/>
+            </w:pPr>
+            <w:r>
+              <w:drawing>
+                <wp:inline xmlns:a="http://schemas.openxmlformats.org/drawingml/2006/main" xmlns:pic="http://schemas.openxmlformats.org/drawingml/2006/picture">
+                  <wp:extent cx="900000" cy="900000"/>
+                  <wp:docPr id="2" name="Picture 2"/>
+                  <wp:cNvGraphicFramePr>
+                    <a:graphicFrameLocks noChangeAspect="1"/>
+                  </wp:cNvGraphicFramePr>
+                  <a:graphic>
+                    <a:graphicData uri="http://schemas.openxmlformats.org/drawingml/2006/picture">
+                      <pic:pic>
+                        <pic:nvPicPr>
+                          <pic:cNvPr id="0" name="image.png"/>
+                          <pic:cNvPicPr/>
+                        </pic:nvPicPr>
+                        <pic:blipFill>
+                          <a:blip r:embed="rId10"/>
+                          <a:stretch>
+                            <a:fillRect/>
+                          </a:stretch>
+                        </pic:blipFill>
+                        <pic:spPr>
+                          <a:xfrm>
+                            <a:off x="0" y="0"/>
+                            <a:ext cx="900000" cy="900000"/>
+                          </a:xfrm>
+                          <a:prstGeom prst="rect"/>
+                        </pic:spPr>
+                      </pic:pic>
+                    </a:graphicData>
+                  </a:graphic>
+                </wp:inline>
+              </w:drawing>
+            </w:r>
+          </w:p>
+        </w:tc>
+        <w:tc>
+          <w:tcPr>
+            <w:tcW w:type="dxa" w:w="2160"/>
+          </w:tcPr>
+          <w:p>
+            <w:r>
+              <w:rPr>
+                <w:rFonts w:ascii="Calibri" w:hAnsi="Calibri"/>
+                <w:b/>
+                <w:sz w:val="16"/>
+              </w:rPr>
+              <w:t>Penn Medicine Nudge Unit | CHTI.</w:t>
+            </w:r>
+          </w:p>
+          <w:p>
+            <w:r>
+              <w:rPr>
+                <w:color w:val="444499"/>
+                <w:sz w:val="12"/>
+              </w:rPr>
+              <w:t>https://chti.upenn.edu/nudge-unit</w:t>
+            </w:r>
+          </w:p>
+        </w:tc>
+      </w:tr>
+      <w:tr>
+        <w:tc>
+          <w:tcPr>
+            <w:tcW w:type="dxa" w:w="2160"/>
+          </w:tcPr>
+          <w:p>
+            <w:pPr>
+              <w:jc w:val="center"/>
+            </w:pPr>
+            <w:r>
+              <w:drawing>
+                <wp:inline xmlns:a="http://schemas.openxmlformats.org/drawingml/2006/main" xmlns:pic="http://schemas.openxmlformats.org/drawingml/2006/picture">
+                  <wp:extent cx="900000" cy="900000"/>
+                  <wp:docPr id="3" name="Picture 3"/>
+                  <wp:cNvGraphicFramePr>
+                    <a:graphicFrameLocks noChangeAspect="1"/>
+                  </wp:cNvGraphicFramePr>
+                  <a:graphic>
+                    <a:graphicData uri="http://schemas.openxmlformats.org/drawingml/2006/picture">
+                      <pic:pic>
+                        <pic:nvPicPr>
+                          <pic:cNvPr id="0" name="image.png"/>
+                          <pic:cNvPicPr/>
+                        </pic:nvPicPr>
+                        <pic:blipFill>
+                          <a:blip r:embed="rId11"/>
+                          <a:stretch>
+                            <a:fillRect/>
+                          </a:stretch>
+                        </pic:blipFill>
+                        <pic:spPr>
+                          <a:xfrm>
+                            <a:off x="0" y="0"/>
+                            <a:ext cx="900000" cy="900000"/>
+                          </a:xfrm>
+                          <a:prstGeom prst="rect"/>
+                        </pic:spPr>
+                      </pic:pic>
+                    </a:graphicData>
+                  </a:graphic>
+                </wp:inline>
+              </w:drawing>
+            </w:r>
+          </w:p>
+        </w:tc>
+        <w:tc>
+          <w:tcPr>
+            <w:tcW w:type="dxa" w:w="2160"/>
+          </w:tcPr>
+          <w:p>
+            <w:r>
+              <w:rPr>
+                <w:rFonts w:ascii="Calibri" w:hAnsi="Calibri"/>
+                <w:b/>
+                <w:sz w:val="16"/>
+              </w:rPr>
+              <w:t>Behavioral Economics in Health: Nudg…</w:t>
+            </w:r>
+          </w:p>
+          <w:p>
+            <w:r>
+              <w:rPr>
+                <w:color w:val="444499"/>
+                <w:sz w:val="12"/>
+              </w:rPr>
+              <w:t>https://rojournals.org/wp-content/uploads/2025/03/ROJAM...</w:t>
+            </w:r>
+          </w:p>
+        </w:tc>
+        <w:tc>
+          <w:tcPr>
+            <w:tcW w:type="dxa" w:w="2160"/>
+          </w:tcPr>
+          <w:p>
+            <w:pPr>
+              <w:jc w:val="center"/>
+            </w:pPr>
+            <w:r>
+              <w:drawing>
+                <wp:inline xmlns:a="http://schemas.openxmlformats.org/drawingml/2006/main" xmlns:pic="http://schemas.openxmlformats.org/drawingml/2006/picture">
+                  <wp:extent cx="900000" cy="900000"/>
+                  <wp:docPr id="4" name="Picture 4"/>
+                  <wp:cNvGraphicFramePr>
+                    <a:graphicFrameLocks noChangeAspect="1"/>
+                  </wp:cNvGraphicFramePr>
+                  <a:graphic>
+                    <a:graphicData uri="http://schemas.openxmlformats.org/drawingml/2006/picture">
+                      <pic:pic>
+                        <pic:nvPicPr>
+                          <pic:cNvPr id="0" name="image.png"/>
+                          <pic:cNvPicPr/>
+                        </pic:nvPicPr>
+                        <pic:blipFill>
+                          <a:blip r:embed="rId12"/>
+                          <a:stretch>
+                            <a:fillRect/>
+                          </a:stretch>
+                        </pic:blipFill>
+                        <pic:spPr>
+                          <a:xfrm>
+                            <a:off x="0" y="0"/>
+                            <a:ext cx="900000" cy="900000"/>
+                          </a:xfrm>
+                          <a:prstGeom prst="rect"/>
+                        </pic:spPr>
+                      </pic:pic>
+                    </a:graphicData>
+                  </a:graphic>
+                </wp:inline>
+              </w:drawing>
+            </w:r>
+          </w:p>
+        </w:tc>
+        <w:tc>
+          <w:tcPr>
+            <w:tcW w:type="dxa" w:w="2160"/>
+          </w:tcPr>
+          <w:p>
+            <w:r>
+              <w:rPr>
+                <w:rFonts w:ascii="Calibri" w:hAnsi="Calibri"/>
+                <w:b/>
+                <w:sz w:val="16"/>
+              </w:rPr>
+              <w:t>ファスト&amp;スロー — あなたの意思はどのように決まるか?</w:t>
+            </w:r>
+          </w:p>
+          <w:p>
+            <w:r>
+              <w:rPr>
+                <w:color w:val="444499"/>
+                <w:sz w:val="12"/>
+              </w:rPr>
+              <w:t>https://www.amazon.co.jp/s?k=ファスト%26スロー+カーネマン+早川書房</w:t>
+            </w:r>
+          </w:p>
+        </w:tc>
+      </w:tr>
+      <w:tr>
+        <w:tc>
+          <w:tcPr>
+            <w:tcW w:type="dxa" w:w="2160"/>
+          </w:tcPr>
+          <w:p>
+            <w:pPr>
+              <w:jc w:val="center"/>
+            </w:pPr>
+            <w:r>
+              <w:drawing>
+                <wp:inline xmlns:a="http://schemas.openxmlformats.org/drawingml/2006/main" xmlns:pic="http://schemas.openxmlformats.org/drawingml/2006/picture">
+                  <wp:extent cx="900000" cy="900000"/>
+                  <wp:docPr id="5" name="Picture 5"/>
+                  <wp:cNvGraphicFramePr>
+                    <a:graphicFrameLocks noChangeAspect="1"/>
+                  </wp:cNvGraphicFramePr>
+                  <a:graphic>
+                    <a:graphicData uri="http://schemas.openxmlformats.org/drawingml/2006/picture">
+                      <pic:pic>
+                        <pic:nvPicPr>
+                          <pic:cNvPr id="0" name="image.png"/>
+                          <pic:cNvPicPr/>
+                        </pic:nvPicPr>
+                        <pic:blipFill>
+                          <a:blip r:embed="rId13"/>
+                          <a:stretch>
+                            <a:fillRect/>
+                          </a:stretch>
+                        </pic:blipFill>
+                        <pic:spPr>
+                          <a:xfrm>
+                            <a:off x="0" y="0"/>
+                            <a:ext cx="900000" cy="900000"/>
+                          </a:xfrm>
+                          <a:prstGeom prst="rect"/>
+                        </pic:spPr>
+                      </pic:pic>
+                    </a:graphicData>
+                  </a:graphic>
+                </wp:inline>
+              </w:drawing>
+            </w:r>
+          </w:p>
+        </w:tc>
+        <w:tc>
+          <w:tcPr>
+            <w:tcW w:type="dxa" w:w="2160"/>
+          </w:tcPr>
+          <w:p>
+            <w:r>
+              <w:rPr>
+                <w:rFonts w:ascii="Calibri" w:hAnsi="Calibri"/>
+                <w:b/>
+                <w:sz w:val="16"/>
+              </w:rPr>
+              <w:t>NUDGE — 実践 行動経済学</w:t>
+            </w:r>
+          </w:p>
+          <w:p>
+            <w:r>
+              <w:rPr>
+                <w:color w:val="444499"/>
+                <w:sz w:val="12"/>
+              </w:rPr>
+              <w:t>https://www.amazon.co.jp/s?k=NUDGE+実践+行動経済学+セイラー+日経BP</w:t>
+            </w:r>
+          </w:p>
+        </w:tc>
+        <w:tc>
+          <w:tcPr>
+            <w:tcW w:type="dxa" w:w="2160"/>
+          </w:tcPr>
+          <w:p>
+            <w:pPr>
+              <w:jc w:val="center"/>
+            </w:pPr>
+            <w:r>
+              <w:drawing>
+                <wp:inline xmlns:a="http://schemas.openxmlformats.org/drawingml/2006/main" xmlns:pic="http://schemas.openxmlformats.org/drawingml/2006/picture">
+                  <wp:extent cx="900000" cy="900000"/>
+                  <wp:docPr id="6" name="Picture 6"/>
+                  <wp:cNvGraphicFramePr>
+                    <a:graphicFrameLocks noChangeAspect="1"/>
+                  </wp:cNvGraphicFramePr>
+                  <a:graphic>
+                    <a:graphicData uri="http://schemas.openxmlformats.org/drawingml/2006/picture">
+                      <pic:pic>
+                        <pic:nvPicPr>
+                          <pic:cNvPr id="0" name="image.png"/>
+                          <pic:cNvPicPr/>
+                        </pic:nvPicPr>
+                        <pic:blipFill>
+                          <a:blip r:embed="rId14"/>
+                          <a:stretch>
+                            <a:fillRect/>
+                          </a:stretch>
+                        </pic:blipFill>
+                        <pic:spPr>
+                          <a:xfrm>
+                            <a:off x="0" y="0"/>
+                            <a:ext cx="900000" cy="900000"/>
+                          </a:xfrm>
+                          <a:prstGeom prst="rect"/>
+                        </pic:spPr>
+                      </pic:pic>
+                    </a:graphicData>
+                  </a:graphic>
+                </wp:inline>
+              </w:drawing>
+            </w:r>
+          </w:p>
+        </w:tc>
+        <w:tc>
+          <w:tcPr>
+            <w:tcW w:type="dxa" w:w="2160"/>
+          </w:tcPr>
+          <w:p>
+            <w:r>
+              <w:rPr>
+                <w:rFonts w:ascii="Calibri" w:hAnsi="Calibri"/>
+                <w:b/>
+                <w:sz w:val="16"/>
+              </w:rPr>
+              <w:t>NIMH RDoC Initiative: Positive Valen…</w:t>
+            </w:r>
+          </w:p>
+          <w:p>
+            <w:r>
+              <w:rPr>
+                <w:color w:val="444499"/>
+                <w:sz w:val="12"/>
+              </w:rPr>
+              <w:t>https://www.nimh.nih.gov/research/research-funded-by-ni...</w:t>
+            </w:r>
+          </w:p>
+        </w:tc>
+      </w:tr>
+    </w:tbl>
+    <w:p/>
     <w:sectPr>
       <w:pgSz w:w="12240" w:h="15840"/>
       <w:pgMar w:top="1440" w:right="1800" w:bottom="1440" w:left="1800" w:header="720" w:footer="720" w:gutter="0"/>

</xml_diff>